<commit_message>
Update the Payment Page guide for the TechGear storefront
New walkthrough: browse the TechGear store, review the cart, check out, pay on
the hosted Payment Page, 3-D Secure, and the verified receipt, plus a section
on the Developer view. Screenshots replaced except the 3DS emulator, whose
gateway screen hasn't changed.

Co-Authored-By: Claude Opus 5.5 <noreply@anthropic.com>
</commit_message>
<xml_diff>
--- a/public/guides/payment-page.docx
+++ b/public/guides/payment-page.docx
@@ -35,7 +35,7 @@
           <w:b/>
           <w:sz w:val="22"/>
         </w:rPr>
-        <w:t>Version 1.0.0</w:t>
+        <w:t>Version 1.1.0</w:t>
       </w:r>
     </w:p>
     <w:p/>
@@ -60,7 +60,7 @@
           <w:color w:val="000000"/>
           <w:sz w:val="22"/>
         </w:rPr>
-        <w:t>This document is a step-by-step guide for Sales and CTS (Customer Technical Support) teams to validate this payment scenario in the Mastercard Gateway MTF (Merchant Test Facility) environment.</w:t>
+        <w:t xml:space="preserve">This document is a step-by-step guide for Sales and CTS (Customer Technical Support) teams to validate this payment scenario in the Mastercard Gateway MTF (Merchant Test Facility) environment.</w:t>
       </w:r>
     </w:p>
     <w:p>
@@ -72,7 +72,7 @@
           <w:color w:val="000000"/>
           <w:sz w:val="22"/>
         </w:rPr>
-        <w:t>The Payment Page is the standard Hosted Checkout redirect flow with no configuration UI. The merchant creates a checkout session and redirects the shopper to the gateway-hosted Payment Page, where payment is completed and the shopper is returned to the merchant. This walkthrough illustrates a card payment with 3-D Secure V2; PayPal, Google Pay and Apple Pay are also available on the same page.</w:t>
+        <w:t xml:space="preserve">The Payment Page is the standard Hosted Checkout redirect flow with no configuration UI. The demo is set in TechGear, a sample hardware store: the shopper fills a cart and checks out, is redirected to the gateway-hosted Payment Page to pay, and returns to a TechGear receipt. The amount charged is the cart total. This walkthrough illustrates a card payment with 3-D Secure V2; PayPal, Google Pay and Apple Pay may also be offered on the same page, depending on the merchant's configuration.</w:t>
       </w:r>
     </w:p>
     <w:p>
@@ -96,7 +96,7 @@
           <w:b/>
           <w:sz w:val="22"/>
         </w:rPr>
-        <w:t>Step 1: Start the checkout</w:t>
+        <w:t>Step 1: Browse the store</w:t>
       </w:r>
     </w:p>
     <w:p>
@@ -108,7 +108,7 @@
           <w:color w:val="000000"/>
           <w:sz w:val="22"/>
         </w:rPr>
-        <w:t>On the merchant page, review the order and select Proceed to Checkout.</w:t>
+        <w:t xml:space="preserve">Open the demo. A thin Demo strip under the header lists the steps and shows the MTF test card. Select Browse Collection or a category, open a product and select Add to Cart.</w:t>
       </w:r>
     </w:p>
     <w:p>
@@ -119,7 +119,7 @@
       <w:r>
         <w:drawing>
           <wp:inline xmlns:a="http://schemas.openxmlformats.org/drawingml/2006/main" xmlns:pic="http://schemas.openxmlformats.org/drawingml/2006/picture">
-            <wp:extent cx="6400800" cy="4752525"/>
+            <wp:extent cx="6400800" cy="4112514"/>
             <wp:docPr id="1" name="Picture 1"/>
             <wp:cNvGraphicFramePr>
               <a:graphicFrameLocks noChangeAspect="1"/>
@@ -128,11 +128,11 @@
               <a:graphicData uri="http://schemas.openxmlformats.org/drawingml/2006/picture">
                 <pic:pic>
                   <pic:nvPicPr>
-                    <pic:cNvPr id="0" name="Screenshot 2026-08-23 at 17.39.51.png"/>
+                    <pic:cNvPr id="0" name="image1.png"/>
                     <pic:cNvPicPr/>
                   </pic:nvPicPr>
                   <pic:blipFill>
-                    <a:blip r:embed="rId10"/>
+                    <a:blip r:embed="rIdImg1"/>
                     <a:stretch>
                       <a:fillRect/>
                     </a:stretch>
@@ -140,7 +140,7 @@
                   <pic:spPr>
                     <a:xfrm>
                       <a:off x="0" y="0"/>
-                      <a:ext cx="6400800" cy="4752525"/>
+                      <a:ext cx="6400800" cy="4112514"/>
                     </a:xfrm>
                     <a:prstGeom prst="rect"/>
                   </pic:spPr>
@@ -162,7 +162,7 @@
           <w:color w:val="595959"/>
           <w:sz w:val="18"/>
         </w:rPr>
-        <w:t>Merchant page — Hosted Checkout Demo (Payment Page); select Proceed to Checkout.</w:t>
+        <w:t xml:space="preserve">TechGear home page — the Demo strip lists the steps and the MTF test card.</w:t>
       </w:r>
     </w:p>
     <w:p>
@@ -174,7 +174,7 @@
           <w:b/>
           <w:sz w:val="22"/>
         </w:rPr>
-        <w:t>Step 2: Choose a payment method</w:t>
+        <w:t>Step 2: Review the cart</w:t>
       </w:r>
     </w:p>
     <w:p>
@@ -186,7 +186,7 @@
           <w:color w:val="000000"/>
           <w:sz w:val="22"/>
         </w:rPr>
-        <w:t>The shopper is redirected to the gateway-hosted Payment Page, which presents the available payment options (Credit/Debit card, PayPal, Google Pay, Apple Pay).</w:t>
+        <w:t xml:space="preserve">Open the cart (top right). Change quantities or add the suggested accessory, then select Proceed to Checkout. The total shown is the amount that will be charged.</w:t>
       </w:r>
     </w:p>
     <w:p>
@@ -197,7 +197,7 @@
       <w:r>
         <w:drawing>
           <wp:inline xmlns:a="http://schemas.openxmlformats.org/drawingml/2006/main" xmlns:pic="http://schemas.openxmlformats.org/drawingml/2006/picture">
-            <wp:extent cx="6400800" cy="5121852"/>
+            <wp:extent cx="6400800" cy="4112514"/>
             <wp:docPr id="2" name="Picture 2"/>
             <wp:cNvGraphicFramePr>
               <a:graphicFrameLocks noChangeAspect="1"/>
@@ -206,11 +206,11 @@
               <a:graphicData uri="http://schemas.openxmlformats.org/drawingml/2006/picture">
                 <pic:pic>
                   <pic:nvPicPr>
-                    <pic:cNvPr id="0" name="Screenshot 2026-08-23 at 17.40.09.png"/>
+                    <pic:cNvPr id="0" name="image2.png"/>
                     <pic:cNvPicPr/>
                   </pic:nvPicPr>
                   <pic:blipFill>
-                    <a:blip r:embed="rId11"/>
+                    <a:blip r:embed="rIdImg2"/>
                     <a:stretch>
                       <a:fillRect/>
                     </a:stretch>
@@ -218,7 +218,7 @@
                   <pic:spPr>
                     <a:xfrm>
                       <a:off x="0" y="0"/>
-                      <a:ext cx="6400800" cy="5121852"/>
+                      <a:ext cx="6400800" cy="4112514"/>
                     </a:xfrm>
                     <a:prstGeom prst="rect"/>
                   </pic:spPr>
@@ -240,7 +240,7 @@
           <w:color w:val="595959"/>
           <w:sz w:val="18"/>
         </w:rPr>
-        <w:t>Redirect to the gateway-hosted Payment Page — available payment options.</w:t>
+        <w:t xml:space="preserve">Cart with two items ($398); select Proceed to Checkout.</w:t>
       </w:r>
     </w:p>
     <w:p>
@@ -252,7 +252,7 @@
           <w:b/>
           <w:sz w:val="22"/>
         </w:rPr>
-        <w:t>Step 3: Enter card details and pay</w:t>
+        <w:t>Step 3: Start the secure payment</w:t>
       </w:r>
     </w:p>
     <w:p>
@@ -264,27 +264,7 @@
           <w:color w:val="000000"/>
           <w:sz w:val="22"/>
         </w:rPr>
-        <w:t>Select Credit or Debit card, complete the fields (cardholder name, card number, expiry date, security code), then select Pay. Example MTF test card: 5123 4500 0000 0008, expiry 01/39, security code 100.</w:t>
-      </w:r>
-    </w:p>
-    <w:p>
-      <w:pPr>
-        <w:spacing w:before="80" w:after="160"/>
-      </w:pPr>
-      <w:r>
-        <w:rPr>
-          <w:b/>
-          <w:color w:val="C00000"/>
-          <w:sz w:val="22"/>
-        </w:rPr>
-        <w:t xml:space="preserve">Notice: </w:t>
-      </w:r>
-      <w:r>
-        <w:rPr>
-          <w:color w:val="C00000"/>
-          <w:sz w:val="22"/>
-        </w:rPr>
-        <w:t>“The next screen you see may be payment card verification through your card issuer.”</w:t>
+        <w:t xml:space="preserve">The TechGear checkout page shows the order summary and a Payment step for Mastercard Hosted Checkout. Select Continue to secure payment. The demo's backend creates a checkout session (INITIATE_CHECKOUT) for the cart, and the browser redirects to the Payment Page.</w:t>
       </w:r>
     </w:p>
     <w:p>
@@ -295,7 +275,7 @@
       <w:r>
         <w:drawing>
           <wp:inline xmlns:a="http://schemas.openxmlformats.org/drawingml/2006/main" xmlns:pic="http://schemas.openxmlformats.org/drawingml/2006/picture">
-            <wp:extent cx="6400800" cy="5567207"/>
+            <wp:extent cx="6400800" cy="4112514"/>
             <wp:docPr id="3" name="Picture 3"/>
             <wp:cNvGraphicFramePr>
               <a:graphicFrameLocks noChangeAspect="1"/>
@@ -304,11 +284,11 @@
               <a:graphicData uri="http://schemas.openxmlformats.org/drawingml/2006/picture">
                 <pic:pic>
                   <pic:nvPicPr>
-                    <pic:cNvPr id="0" name="Screenshot 2026-08-23 at 17.40.34.png"/>
+                    <pic:cNvPr id="0" name="image3.png"/>
                     <pic:cNvPicPr/>
                   </pic:nvPicPr>
                   <pic:blipFill>
-                    <a:blip r:embed="rId12"/>
+                    <a:blip r:embed="rIdImg3"/>
                     <a:stretch>
                       <a:fillRect/>
                     </a:stretch>
@@ -316,7 +296,7 @@
                   <pic:spPr>
                     <a:xfrm>
                       <a:off x="0" y="0"/>
-                      <a:ext cx="6400800" cy="5567207"/>
+                      <a:ext cx="6400800" cy="4112514"/>
                     </a:xfrm>
                     <a:prstGeom prst="rect"/>
                   </pic:spPr>
@@ -338,7 +318,7 @@
           <w:color w:val="595959"/>
           <w:sz w:val="18"/>
         </w:rPr>
-        <w:t>Credit or Debit card selected and details entered; select Pay.</w:t>
+        <w:t xml:space="preserve">TechGear checkout — select Continue to secure payment.</w:t>
       </w:r>
     </w:p>
     <w:p>
@@ -350,7 +330,7 @@
           <w:b/>
           <w:sz w:val="22"/>
         </w:rPr>
-        <w:t>Step 4: Complete 3-D Secure authentication</w:t>
+        <w:t>Step 4: Pay on the Payment Page</w:t>
       </w:r>
     </w:p>
     <w:p>
@@ -362,7 +342,117 @@
           <w:color w:val="000000"/>
           <w:sz w:val="22"/>
         </w:rPr>
-        <w:t>In MTF the ACS Emulator for 3DS V2 appears. Select the authentication result — for a successful flow choose “(Y) Authentication/Account Verification Successful” — then Submit.</w:t>
+        <w:t xml:space="preserve">The gateway-hosted Payment Page lists the cart's items and total in its Order summary. If several payment options are shown, choose Credit or Debit card.</w:t>
+      </w:r>
+    </w:p>
+    <w:p>
+      <w:pPr>
+        <w:spacing w:after="120"/>
+      </w:pPr>
+      <w:r>
+        <w:rPr>
+          <w:color w:val="000000"/>
+          <w:sz w:val="22"/>
+        </w:rPr>
+        <w:t xml:space="preserve">Complete the fields (cardholder name, card number, expiry date, security code), then select Pay. Example MTF test card: 5123 4500 0000 0008, expiry 01/39, security code 100.</w:t>
+      </w:r>
+    </w:p>
+    <w:p>
+      <w:pPr>
+        <w:spacing w:before="80" w:after="160"/>
+      </w:pPr>
+      <w:r>
+        <w:rPr>
+          <w:b/>
+          <w:color w:val="C00000"/>
+          <w:sz w:val="22"/>
+        </w:rPr>
+        <w:t xml:space="preserve">Notice: </w:t>
+      </w:r>
+      <w:r>
+        <w:rPr>
+          <w:color w:val="C00000"/>
+          <w:sz w:val="22"/>
+        </w:rPr>
+        <w:t xml:space="preserve">“The next screen you see may be payment card verification through your card issuer.”</w:t>
+      </w:r>
+    </w:p>
+    <w:p>
+      <w:pPr>
+        <w:spacing w:before="80"/>
+        <w:jc w:val="center"/>
+      </w:pPr>
+      <w:r>
+        <w:drawing>
+          <wp:inline xmlns:a="http://schemas.openxmlformats.org/drawingml/2006/main" xmlns:pic="http://schemas.openxmlformats.org/drawingml/2006/picture">
+            <wp:extent cx="6400800" cy="4112514"/>
+            <wp:docPr id="4" name="Picture 4"/>
+            <wp:cNvGraphicFramePr>
+              <a:graphicFrameLocks noChangeAspect="1"/>
+            </wp:cNvGraphicFramePr>
+            <a:graphic>
+              <a:graphicData uri="http://schemas.openxmlformats.org/drawingml/2006/picture">
+                <pic:pic>
+                  <pic:nvPicPr>
+                    <pic:cNvPr id="0" name="image4.png"/>
+                    <pic:cNvPicPr/>
+                  </pic:nvPicPr>
+                  <pic:blipFill>
+                    <a:blip r:embed="rIdImg4"/>
+                    <a:stretch>
+                      <a:fillRect/>
+                    </a:stretch>
+                  </pic:blipFill>
+                  <pic:spPr>
+                    <a:xfrm>
+                      <a:off x="0" y="0"/>
+                      <a:ext cx="6400800" cy="4112514"/>
+                    </a:xfrm>
+                    <a:prstGeom prst="rect"/>
+                  </pic:spPr>
+                </pic:pic>
+              </a:graphicData>
+            </a:graphic>
+          </wp:inline>
+        </w:drawing>
+      </w:r>
+    </w:p>
+    <w:p>
+      <w:pPr>
+        <w:spacing w:after="200"/>
+        <w:jc w:val="center"/>
+      </w:pPr>
+      <w:r>
+        <w:rPr>
+          <w:i/>
+          <w:color w:val="595959"/>
+          <w:sz w:val="18"/>
+        </w:rPr>
+        <w:t xml:space="preserve">Mastercard-hosted Payment Page — the order summary lists the TechGear items.</w:t>
+      </w:r>
+    </w:p>
+    <w:p>
+      <w:pPr>
+        <w:spacing w:before="200" w:after="40"/>
+      </w:pPr>
+      <w:r>
+        <w:rPr>
+          <w:b/>
+          <w:sz w:val="22"/>
+        </w:rPr>
+        <w:t>Step 5: Complete 3-D Secure authentication</w:t>
+      </w:r>
+    </w:p>
+    <w:p>
+      <w:pPr>
+        <w:spacing w:after="120"/>
+      </w:pPr>
+      <w:r>
+        <w:rPr>
+          <w:color w:val="000000"/>
+          <w:sz w:val="22"/>
+        </w:rPr>
+        <w:t xml:space="preserve">In MTF the ACS Emulator for 3DS V2 appears. Select the authentication result — for a successful flow choose “(Y) Authentication/Account Verification Successful” — then Submit.</w:t>
       </w:r>
     </w:p>
     <w:p>
@@ -382,7 +472,7 @@
           <w:color w:val="C00000"/>
           <w:sz w:val="22"/>
         </w:rPr>
-        <w:t>This emulator screen appears only in test environments. In production the shopper completes real issuer authentication.</w:t>
+        <w:t xml:space="preserve">This emulator screen appears only in test environments. In production the shopper completes real issuer authentication.</w:t>
       </w:r>
     </w:p>
     <w:p>
@@ -394,7 +484,7 @@
         <w:drawing>
           <wp:inline xmlns:a="http://schemas.openxmlformats.org/drawingml/2006/main" xmlns:pic="http://schemas.openxmlformats.org/drawingml/2006/picture">
             <wp:extent cx="6400800" cy="3647248"/>
-            <wp:docPr id="4" name="Picture 4"/>
+            <wp:docPr id="5" name="Picture 5"/>
             <wp:cNvGraphicFramePr>
               <a:graphicFrameLocks noChangeAspect="1"/>
             </wp:cNvGraphicFramePr>
@@ -402,11 +492,11 @@
               <a:graphicData uri="http://schemas.openxmlformats.org/drawingml/2006/picture">
                 <pic:pic>
                   <pic:nvPicPr>
-                    <pic:cNvPr id="0" name="Screenshot 2026-08-23 at 17.40.49.png"/>
+                    <pic:cNvPr id="0" name="image5.png"/>
                     <pic:cNvPicPr/>
                   </pic:nvPicPr>
                   <pic:blipFill>
-                    <a:blip r:embed="rId13"/>
+                    <a:blip r:embed="rIdImg5"/>
                     <a:stretch>
                       <a:fillRect/>
                     </a:stretch>
@@ -436,7 +526,7 @@
           <w:color w:val="595959"/>
           <w:sz w:val="18"/>
         </w:rPr>
-        <w:t>3-D Secure V2 — ACS Emulator authentication result, then Submit.</w:t>
+        <w:t xml:space="preserve">3-D Secure V2 — ACS Emulator authentication result, then Submit.</w:t>
       </w:r>
     </w:p>
     <w:p>
@@ -448,7 +538,7 @@
           <w:b/>
           <w:sz w:val="22"/>
         </w:rPr>
-        <w:t>Step 5: Confirmation</w:t>
+        <w:t>Step 6: Confirmation</w:t>
       </w:r>
     </w:p>
     <w:p>
@@ -460,7 +550,19 @@
           <w:color w:val="000000"/>
           <w:sz w:val="22"/>
         </w:rPr>
-        <w:t>The shopper is returned to the merchant receipt page, which confirms the order with the amount, Order ID, Transaction ID, status and technical details (session and checkout versions).</w:t>
+        <w:t xml:space="preserve">The shopper returns to the TechGear receipt. The demo confirms the payment by checking that the resultIndicator sent back by the gateway matches the successIndicator issued when the session was created. Only then is the order shown as confirmed and the cart emptied.</w:t>
+      </w:r>
+    </w:p>
+    <w:p>
+      <w:pPr>
+        <w:spacing w:after="120"/>
+      </w:pPr>
+      <w:r>
+        <w:rPr>
+          <w:color w:val="000000"/>
+          <w:sz w:val="22"/>
+        </w:rPr>
+        <w:t xml:space="preserve">The receipt lists the order number, items, total and result indicator. If the indicators don't match, the page says the payment didn't go through and offers Back to cart.</w:t>
       </w:r>
     </w:p>
     <w:p>
@@ -471,8 +573,8 @@
       <w:r>
         <w:drawing>
           <wp:inline xmlns:a="http://schemas.openxmlformats.org/drawingml/2006/main" xmlns:pic="http://schemas.openxmlformats.org/drawingml/2006/picture">
-            <wp:extent cx="6400800" cy="7562427"/>
-            <wp:docPr id="5" name="Picture 5"/>
+            <wp:extent cx="6400800" cy="4112514"/>
+            <wp:docPr id="6" name="Picture 6"/>
             <wp:cNvGraphicFramePr>
               <a:graphicFrameLocks noChangeAspect="1"/>
             </wp:cNvGraphicFramePr>
@@ -480,11 +582,11 @@
               <a:graphicData uri="http://schemas.openxmlformats.org/drawingml/2006/picture">
                 <pic:pic>
                   <pic:nvPicPr>
-                    <pic:cNvPr id="0" name="Screenshot 2026-08-23 at 17.41.12.png"/>
+                    <pic:cNvPr id="0" name="image6.png"/>
                     <pic:cNvPicPr/>
                   </pic:nvPicPr>
                   <pic:blipFill>
-                    <a:blip r:embed="rId14"/>
+                    <a:blip r:embed="rIdImg6"/>
                     <a:stretch>
                       <a:fillRect/>
                     </a:stretch>
@@ -492,7 +594,7 @@
                   <pic:spPr>
                     <a:xfrm>
                       <a:off x="0" y="0"/>
-                      <a:ext cx="6400800" cy="7562427"/>
+                      <a:ext cx="6400800" cy="4112514"/>
                     </a:xfrm>
                     <a:prstGeom prst="rect"/>
                   </pic:spPr>
@@ -514,7 +616,105 @@
           <w:color w:val="595959"/>
           <w:sz w:val="18"/>
         </w:rPr>
-        <w:t>Merchant receipt — Payment Successful with transaction and technical details.</w:t>
+        <w:t xml:space="preserve">TechGear receipt — order confirmed after the result indicator is verified.</w:t>
+      </w:r>
+    </w:p>
+    <w:p>
+      <w:pPr>
+        <w:spacing w:before="200" w:after="40"/>
+      </w:pPr>
+      <w:r>
+        <w:rPr>
+          <w:b/>
+          <w:sz w:val="22"/>
+        </w:rPr>
+        <w:t>Behind the scenes: Developer view</w:t>
+      </w:r>
+    </w:p>
+    <w:p>
+      <w:pPr>
+        <w:spacing w:after="120"/>
+      </w:pPr>
+      <w:r>
+        <w:rPr>
+          <w:color w:val="000000"/>
+          <w:sz w:val="22"/>
+        </w:rPr>
+        <w:t xml:space="preserve">On the checkout and receipt pages, the Developer view tab on the right edge opens a drawer. Network calls lists the API calls behind the checkout (Create checkout session, then Checkout.configure and showPaymentPage) with their request and response bodies. How it works explains the four stages of the flow.</w:t>
+      </w:r>
+    </w:p>
+    <w:p>
+      <w:pPr>
+        <w:spacing w:before="80" w:after="160"/>
+      </w:pPr>
+      <w:r>
+        <w:rPr>
+          <w:b/>
+          <w:color w:val="C00000"/>
+          <w:sz w:val="22"/>
+        </w:rPr>
+        <w:t xml:space="preserve">Note: </w:t>
+      </w:r>
+      <w:r>
+        <w:rPr>
+          <w:color w:val="C00000"/>
+          <w:sz w:val="22"/>
+        </w:rPr>
+        <w:t xml:space="preserve">Open the Developer view when presenting to technical audiences; keep it closed for a shopper's-eye demo.</w:t>
+      </w:r>
+    </w:p>
+    <w:p>
+      <w:pPr>
+        <w:spacing w:before="80"/>
+        <w:jc w:val="center"/>
+      </w:pPr>
+      <w:r>
+        <w:drawing>
+          <wp:inline xmlns:a="http://schemas.openxmlformats.org/drawingml/2006/main" xmlns:pic="http://schemas.openxmlformats.org/drawingml/2006/picture">
+            <wp:extent cx="6400800" cy="4112514"/>
+            <wp:docPr id="7" name="Picture 7"/>
+            <wp:cNvGraphicFramePr>
+              <a:graphicFrameLocks noChangeAspect="1"/>
+            </wp:cNvGraphicFramePr>
+            <a:graphic>
+              <a:graphicData uri="http://schemas.openxmlformats.org/drawingml/2006/picture">
+                <pic:pic>
+                  <pic:nvPicPr>
+                    <pic:cNvPr id="0" name="image7.png"/>
+                    <pic:cNvPicPr/>
+                  </pic:nvPicPr>
+                  <pic:blipFill>
+                    <a:blip r:embed="rIdImg7"/>
+                    <a:stretch>
+                      <a:fillRect/>
+                    </a:stretch>
+                  </pic:blipFill>
+                  <pic:spPr>
+                    <a:xfrm>
+                      <a:off x="0" y="0"/>
+                      <a:ext cx="6400800" cy="4112514"/>
+                    </a:xfrm>
+                    <a:prstGeom prst="rect"/>
+                  </pic:spPr>
+                </pic:pic>
+              </a:graphicData>
+            </a:graphic>
+          </wp:inline>
+        </w:drawing>
+      </w:r>
+    </w:p>
+    <w:p>
+      <w:pPr>
+        <w:spacing w:after="200"/>
+        <w:jc w:val="center"/>
+      </w:pPr>
+      <w:r>
+        <w:rPr>
+          <w:i/>
+          <w:color w:val="595959"/>
+          <w:sz w:val="18"/>
+        </w:rPr>
+        <w:t xml:space="preserve">Developer view — How it works.</w:t>
       </w:r>
     </w:p>
     <w:p>

</xml_diff>

<commit_message>
Payment Page guide: payment-options screenshot and the Back link
Step 4 now shows the live merchant's payment options (card, PayPal, Google
Pay) with the TechGear basket, and explains that Back returns the shopper to
the TechGear checkout.

Co-Authored-By: Claude Opus 5.5 <noreply@anthropic.com>
</commit_message>
<xml_diff>
--- a/public/guides/payment-page.docx
+++ b/public/guides/payment-page.docx
@@ -342,7 +342,7 @@
           <w:color w:val="000000"/>
           <w:sz w:val="22"/>
         </w:rPr>
-        <w:t xml:space="preserve">The gateway-hosted Payment Page lists the cart's items and total in its Order summary. If several payment options are shown, choose Credit or Debit card.</w:t>
+        <w:t xml:space="preserve">The gateway-hosted Payment Page shows the payment options (Credit or Debit card, PayPal, Google Pay) and lists the cart's items and total in its Order summary. Choose Credit or Debit card.</w:t>
       </w:r>
     </w:p>
     <w:p>
@@ -355,6 +355,18 @@
           <w:sz w:val="22"/>
         </w:rPr>
         <w:t xml:space="preserve">Complete the fields (cardholder name, card number, expiry date, security code), then select Pay. Example MTF test card: 5123 4500 0000 0008, expiry 01/39, security code 100.</w:t>
+      </w:r>
+    </w:p>
+    <w:p>
+      <w:pPr>
+        <w:spacing w:after="120"/>
+      </w:pPr>
+      <w:r>
+        <w:rPr>
+          <w:color w:val="000000"/>
+          <w:sz w:val="22"/>
+        </w:rPr>
+        <w:t xml:space="preserve">To abandon the payment, select Back at the top of the page. The shopper returns to the TechGear checkout with the order still in place and can try again.</w:t>
       </w:r>
     </w:p>
     <w:p>
@@ -428,7 +440,7 @@
           <w:color w:val="595959"/>
           <w:sz w:val="18"/>
         </w:rPr>
-        <w:t xml:space="preserve">Mastercard-hosted Payment Page — the order summary lists the TechGear items.</w:t>
+        <w:t xml:space="preserve">Mastercard-hosted Payment Page — payment options, with the TechGear items in the order summary.</w:t>
       </w:r>
     </w:p>
     <w:p>

</xml_diff>